<commit_message>
feat(c04): FILM - sectiune ARC TRANSFORMARE (pas spre Biblia v2.0)
Arcul din Studiu (BOMBA/RECUNOASTERE/GRESEALA/AHA/CINE DEVII) codificat in
FILM dupa MOTTO, ca FILM sa ramana sursa de adevar textuala (L163).
</commit_message>
<xml_diff>
--- a/c04/FILM-Excel-04-Normalizare.docx
+++ b/c04/FILM-Excel-04-Normalizare.docx
@@ -191,6 +191,90 @@
           <w:sz w:val="20"/>
         </w:rPr>
         <w:t>Nu curățăm de mână. Construim fluxul.</w:t>
+      </w:r>
+    </w:p>
+    <w:p>
+      <w:pPr>
+        <w:spacing w:before="200" w:after="80"/>
+      </w:pPr>
+      <w:r>
+        <w:rPr>
+          <w:b/>
+          <w:sz w:val="26"/>
+        </w:rPr>
+        <w:t xml:space="preserve">ARC TRANSFORMARE · CINE DEVINE CURSANTUL</w:t>
+      </w:r>
+    </w:p>
+    <w:p>
+      <w:pPr>
+        <w:spacing w:after="80"/>
+      </w:pPr>
+      <w:r>
+        <w:rPr>
+          <w:rFonts w:ascii="Calibri" w:hAnsi="Calibri"/>
+          <w:sz w:val="20"/>
+        </w:rPr>
+        <w:t xml:space="preserve">Stratul pedagogic din HTML-Studiu (sursa de adevăr a arcului, propagat de aici). Două voci: TU (persoana a II-a) și DATE (tehnic).</w:t>
+      </w:r>
+    </w:p>
+    <w:p>
+      <w:pPr>
+        <w:spacing w:after="80"/>
+      </w:pPr>
+      <w:r>
+        <w:rPr>
+          <w:rFonts w:ascii="Calibri" w:hAnsi="Calibri"/>
+          <w:sz w:val="20"/>
+        </w:rPr>
+        <w:t xml:space="preserve">BOMBA (idee dominantă): Fișierul curat nu e rezultatul. Fluxul este.</w:t>
+      </w:r>
+    </w:p>
+    <w:p>
+      <w:pPr>
+        <w:spacing w:after="80"/>
+      </w:pPr>
+      <w:r>
+        <w:rPr>
+          <w:rFonts w:ascii="Calibri" w:hAnsi="Calibri"/>
+          <w:sz w:val="20"/>
+        </w:rPr>
+        <w:t xml:space="preserve">SUNĂ CUNOSCUT (recunoaștere): Primești un export, îl cureți de mână. Și totuși: vine altul și o iei de la capăt; aceleași corecturi în fiecare lună; nimeni nu știe ce pași ai aplicat, nici tu peste o săptămână.</w:t>
+      </w:r>
+    </w:p>
+    <w:p>
+      <w:pPr>
+        <w:spacing w:after="80"/>
+      </w:pPr>
+      <w:r>
+        <w:rPr>
+          <w:rFonts w:ascii="Calibri" w:hAnsi="Calibri"/>
+          <w:sz w:val="20"/>
+        </w:rPr>
+        <w:t xml:space="preserve">GREȘEALA CLASICĂ: Oamenii curăță fișierul. Profesioniștii construiesc fluxul.</w:t>
+      </w:r>
+    </w:p>
+    <w:p>
+      <w:pPr>
+        <w:spacing w:after="80"/>
+      </w:pPr>
+      <w:r>
+        <w:rPr>
+          <w:rFonts w:ascii="Calibri" w:hAnsi="Calibri"/>
+          <w:sz w:val="20"/>
+        </w:rPr>
+        <w:t xml:space="preserve">AHA (vârf): Munca pe care o repeți la fiecare export nu trebuia făcută de mână niciodată.</w:t>
+      </w:r>
+    </w:p>
+    <w:p>
+      <w:pPr>
+        <w:spacing w:after="80"/>
+      </w:pPr>
+      <w:r>
+        <w:rPr>
+          <w:rFonts w:ascii="Calibri" w:hAnsi="Calibri"/>
+          <w:sz w:val="20"/>
+        </w:rPr>
+        <w:t xml:space="preserve">CINE DEVII (promisiune): Nu mai cureți date. Construiești mecanisme.</w:t>
       </w:r>
     </w:p>
     <w:p>

</xml_diff>

<commit_message>
feat(c04): FILM - formula finala + nota video Prompt 2 (variantă scurtă)
Formula ARHITECT ca teza de inchidere ('C04 nu este despre curatare...') +
varianta scurta a Promptului 2 pentru naratiunea video (scrisul pastreaza
promptul complet). Feedback extern G-06 SIGUR.
</commit_message>
<xml_diff>
--- a/c04/FILM-Excel-04-Normalizare.docx
+++ b/c04/FILM-Excel-04-Normalizare.docx
@@ -2194,6 +2194,66 @@
           <w:sz w:val="20"/>
         </w:rPr>
         <w:t>Tabelul predat. Sfârșit film.</w:t>
+      </w:r>
+    </w:p>
+    <w:p>
+      <w:pPr>
+        <w:spacing w:before="200" w:after="80"/>
+      </w:pPr>
+      <w:r>
+        <w:rPr>
+          <w:b/>
+          <w:sz w:val="26"/>
+        </w:rPr>
+        <w:t xml:space="preserve">FORMULA FINALĂ</w:t>
+      </w:r>
+    </w:p>
+    <w:p>
+      <w:pPr>
+        <w:spacing w:after="80"/>
+      </w:pPr>
+      <w:r>
+        <w:rPr>
+          <w:rFonts w:ascii="Calibri" w:hAnsi="Calibri"/>
+          <w:sz w:val="20"/>
+        </w:rPr>
+        <w:t xml:space="preserve">C04 nu este despre curățare. Este despre a nu mai curăța niciodată manual același tip de export.</w:t>
+      </w:r>
+    </w:p>
+    <w:p>
+      <w:pPr>
+        <w:spacing w:before="200" w:after="80"/>
+      </w:pPr>
+      <w:r>
+        <w:rPr>
+          <w:b/>
+          <w:sz w:val="26"/>
+        </w:rPr>
+        <w:t xml:space="preserve">NOTĂ VIDEO · PROMPT 2 (variantă scurtă)</w:t>
+      </w:r>
+    </w:p>
+    <w:p>
+      <w:pPr>
+        <w:spacing w:after="80"/>
+      </w:pPr>
+      <w:r>
+        <w:rPr>
+          <w:rFonts w:ascii="Calibri" w:hAnsi="Calibri"/>
+          <w:sz w:val="20"/>
+        </w:rPr>
+        <w:t xml:space="preserve">În materialul scris rămâne promptul complet de cod M. La narațiunea video se folosește varianta scurtă, restul se explică live:</w:t>
+      </w:r>
+    </w:p>
+    <w:p>
+      <w:pPr>
+        <w:spacing w:after="80"/>
+      </w:pPr>
+      <w:r>
+        <w:rPr>
+          <w:rFonts w:ascii="Calibri" w:hAnsi="Calibri"/>
+          <w:sz w:val="20"/>
+        </w:rPr>
+        <w:t xml:space="preserve">„Generează cod M pentru fluxul Power Query cu cei 10 pași canonici, în ordine, cu output final Excel Table numit Vanzari_Normalizat. Dă-mi doar codul, fără explicații.”</w:t>
       </w:r>
     </w:p>
     <w:p>

</xml_diff>

<commit_message>
feat(c04): rescrie corp FILM C04 - voce NORMALIZARE/AUTOMATIZARE diferentiata per etapa
Inlocuit boilerplate complet (6 etape x 6 campuri = 36 campuri):
- STARE: de la 'Recunoastere si control' generic la determinare/arhitect/constructor/inginer/automatizare/predare-sistem
- VOCEA: de la 'Nu construim mai mult decat e necesar' la voce Power Query specifica per etapa
- DEMONSTRATIA: cu Applied Steps concrete, Power Query Editor, Close&Load, AGGREGATE, Refresh All
- INTERVENTIA AI: arhitectura flux, dependente intre pasi, sintaxa M, verificare idempotenta
- MOMENT DE CONTROL: martorul 7.986.019,38 lei + starea fluxului per etapa
- REVEAL: panoul Applied Steps, tabelul Vanzari_Normalizat, mecanismul viu

https://claude.ai/code/session_01Phtxoyb18AHdkKHEfoi96m
</commit_message>
<xml_diff>
--- a/c04/FILM-Excel-04-Normalizare.docx
+++ b/c04/FILM-Excel-04-Normalizare.docx
@@ -1020,7 +1020,7 @@
           <w:rFonts w:ascii="Calibri" w:hAnsi="Calibri"/>
           <w:sz w:val="20"/>
         </w:rPr>
-        <w:t>Recunoaștere și control. Nu inventăm, urmărim fenomenul.</w:t>
+        <w:t>Determinare de constructor. Contaminările sunt cunoscute. Acum construim mecanismul care le elimină pentru totdeauna.</w:t>
       </w:r>
     </w:p>
     <w:p>
@@ -1045,7 +1045,7 @@
           <w:i/>
           <w:sz w:val="20"/>
         </w:rPr>
-        <w:t>„Etapa 1: realitate. Nu construim mai mult decât e necesar."</w:t>
+        <w:t>„Preiau de la C03 lista completă a celor 550 contaminări și coloanele-martor cu dovada recuperabilității. Acum construiesc fluxul care le elimină automat la fiecare Refresh."</w:t>
       </w:r>
     </w:p>
     <w:p>
@@ -1069,7 +1069,7 @@
           <w:rFonts w:ascii="Calibri" w:hAnsi="Calibri"/>
           <w:sz w:val="20"/>
         </w:rPr>
-        <w:t>Pe ecran: acțiunile concrete ale etapei 1. Cursorul navighează, AI raportează, datele se schimbă controlat.</w:t>
+        <w:t>Pe ecran: deschidem fișierul predat de C03 cu coloanele-martor. Notăm cele 10 transformări necesare: Promoted Headers, Filtered Rows, Removed Duplicates, Changed Type, Trim+Clean pe text, Parsed Date, Normalized Diacritics, Removed Other Columns. Martorul: 7.986.019,38 lei.</w:t>
       </w:r>
     </w:p>
     <w:p>
@@ -1093,7 +1093,7 @@
           <w:rFonts w:ascii="Calibri" w:hAnsi="Calibri"/>
           <w:sz w:val="20"/>
         </w:rPr>
-        <w:t>AI propune, noi confirmăm. Niciun pas neexplicit.</w:t>
+        <w:t>AI proiectează arhitectura fluxului: cei 10 Applied Steps în ordinea optimă pentru Power Query. Confirmăm ordinea — Promoted Headers primul, Changed Type ultimul.</w:t>
       </w:r>
     </w:p>
     <w:p>
@@ -1117,7 +1117,7 @@
           <w:rFonts w:ascii="Calibri" w:hAnsi="Calibri"/>
           <w:sz w:val="20"/>
         </w:rPr>
-        <w:t>Confirmăm martorul: 'Etapa 1 confirmată. Predăm mai departe.'</w:t>
+        <w:t>„10 Applied Steps arhitecturate. Martorul fixat. Nimic construit încă — arhitectura urmează execuția."</w:t>
       </w:r>
     </w:p>
     <w:p>
@@ -1142,7 +1142,7 @@
           <w:rFonts w:ascii="Calibri" w:hAnsi="Calibri"/>
           <w:sz w:val="20"/>
         </w:rPr>
-        <w:t>Pe ecran: efectul etapei 1 vizibil. Fenomenul recunoscut, transformat sau verificat.</w:t>
+        <w:t>Pe ecran: schița celor 10 Applied Steps planificați. Planul fluxului, înainte de Power Query.</w:t>
       </w:r>
     </w:p>
     <w:p>
@@ -1226,7 +1226,7 @@
           <w:rFonts w:ascii="Calibri" w:hAnsi="Calibri"/>
           <w:sz w:val="20"/>
         </w:rPr>
-        <w:t>Recunoaștere și control. Nu inventăm, urmărim fenomenul.</w:t>
+        <w:t>Privire de arhitect. Fiecare transformare are o ordine și o logică. Ordinea greșită înseamnă output greșit.</w:t>
       </w:r>
     </w:p>
     <w:p>
@@ -1251,7 +1251,7 @@
           <w:i/>
           <w:sz w:val="20"/>
         </w:rPr>
-        <w:t>„Etapa 2: investigatie. Nu construim mai mult decât e necesar."</w:t>
+        <w:t>„Înainte să deschid Power Query, înțeleg dependențele: de ce Removed Rows înainte de Changed Type? De ce Trim înainte de Parsed Date? Ordinea nu e arbitrară."</w:t>
       </w:r>
     </w:p>
     <w:p>
@@ -1275,7 +1275,7 @@
           <w:rFonts w:ascii="Calibri" w:hAnsi="Calibri"/>
           <w:sz w:val="20"/>
         </w:rPr>
-        <w:t>Pe ecran: acțiunile concrete ale etapei 2. Cursorul navighează, AI raportează, datele se schimbă controlat.</w:t>
+        <w:t>Pe ecran: Promptul 1 în Copilot cere explicația dependențelor dintre cei 10 pași. AI explică: dacă schimbi tipul înainte să filtrezi SUBTOTAL-urile, rândurile cu text în coloana numerică dau eroare de tip. Ordinea e arhitecturală.</w:t>
       </w:r>
     </w:p>
     <w:p>
@@ -1299,7 +1299,7 @@
           <w:rFonts w:ascii="Calibri" w:hAnsi="Calibri"/>
           <w:sz w:val="20"/>
         </w:rPr>
-        <w:t>AI propune, noi confirmăm. Niciun pas neexplicit.</w:t>
+        <w:t>AI explică rațiunea fiecărui pas și dependența față de cel anterior. Noi confirmăm că înțelegem ordinea înainte să construim — construcția fără înțelegere e fragilă.</w:t>
       </w:r>
     </w:p>
     <w:p>
@@ -1323,7 +1323,7 @@
           <w:rFonts w:ascii="Calibri" w:hAnsi="Calibri"/>
           <w:sz w:val="20"/>
         </w:rPr>
-        <w:t>Confirmăm martorul: 'Etapa 2 confirmată. Predăm mai departe.'</w:t>
+        <w:t>„10 pași, 10 dependențe înțelese. Construcția urmează arhitectura, nu improvizația."</w:t>
       </w:r>
     </w:p>
     <w:p>
@@ -1347,7 +1347,7 @@
           <w:rFonts w:ascii="Calibri" w:hAnsi="Calibri"/>
           <w:sz w:val="20"/>
         </w:rPr>
-        <w:t>Pe ecran: efectul etapei 2 vizibil. Fenomenul recunoscut, transformat sau verificat.</w:t>
+        <w:t>Pe ecran: diagrama de dependențe dintre cei 10 Applied Steps. Fluxul are o logică internă. Nu e o listă de transformări — e un mecanism cu ordine.</w:t>
       </w:r>
     </w:p>
     <w:p>
@@ -1431,7 +1431,7 @@
           <w:rFonts w:ascii="Calibri" w:hAnsi="Calibri"/>
           <w:sz w:val="20"/>
         </w:rPr>
-        <w:t>Recunoaștere și control. Nu inventăm, urmărim fenomenul.</w:t>
+        <w:t>Focus de constructor. Fiecare pas construit în Power Query e un pas mai aproape de mecanismul permanent.</w:t>
       </w:r>
     </w:p>
     <w:p>
@@ -1456,7 +1456,7 @@
           <w:i/>
           <w:sz w:val="20"/>
         </w:rPr>
-        <w:t>„Etapa 3: transformare. Nu construim mai mult decât e necesar."</w:t>
+        <w:t>„Deschid Power Query. Data → Get Data → From File. Cei 10 Applied Steps se construiesc unul câte unul în panoul lateral. Vizibili. Controlabili. Repetabili."</w:t>
       </w:r>
     </w:p>
     <w:p>
@@ -1480,7 +1480,7 @@
           <w:rFonts w:ascii="Calibri" w:hAnsi="Calibri"/>
           <w:sz w:val="20"/>
         </w:rPr>
-        <w:t>Pe ecran: acțiunile concrete ale etapei 3. Cursorul navighează, AI raportează, datele se schimbă controlat.</w:t>
+        <w:t>Pe ecran: Power Query Editor activ. Step 1: Promoted Headers. Step 2: Filtered Rows — SUBTOTAL, TOTAL, blank eliminate. Step 3: Removed Duplicates. Step 4: Changed Type — cantitate la Int64. Step 5: Text.Trim+Text.Clean pe [nume_client]. Step 6: Date.From pe [data_factura]. Step 7: Table.ReplaceValue pe [judet] — diacritice normalizate. 7 din 10 pași aplicați. Panoul Applied Steps crește.</w:t>
       </w:r>
     </w:p>
     <w:p>
@@ -1504,7 +1504,7 @@
           <w:rFonts w:ascii="Calibri" w:hAnsi="Calibri"/>
           <w:sz w:val="20"/>
         </w:rPr>
-        <w:t>AI propune, noi confirmăm. Niciun pas neexplicit.</w:t>
+        <w:t>AI propune sintaxa M pentru fiecare pas complex — Text.Trim, Date.From, Table.ReplaceValue. Noi confirmăm fiecare pas în Power Query înainte să trecem la următorul.</w:t>
       </w:r>
     </w:p>
     <w:p>
@@ -1528,7 +1528,7 @@
           <w:rFonts w:ascii="Calibri" w:hAnsi="Calibri"/>
           <w:sz w:val="20"/>
         </w:rPr>
-        <w:t>Confirmăm martorul: 'Etapa 3 confirmată. Predăm mai departe.'</w:t>
+        <w:t>„7 din 10 Applied Steps construiți. Preview: 1.990 rânduri curate. 10 duplicate și 53 blank — eliminate."</w:t>
       </w:r>
     </w:p>
     <w:p>
@@ -1552,7 +1552,7 @@
           <w:rFonts w:ascii="Calibri" w:hAnsi="Calibri"/>
           <w:sz w:val="20"/>
         </w:rPr>
-        <w:t>Pe ecran: efectul etapei 3 vizibil. Fenomenul recunoscut, transformat sau verificat.</w:t>
+        <w:t>Pe ecran: panoul Applied Steps cu 7 pași iluminați. Preview tabelul parțial normalizat. Mecanismul prinde formă.</w:t>
       </w:r>
     </w:p>
     <w:p>
@@ -1637,7 +1637,7 @@
           <w:rFonts w:ascii="Calibri" w:hAnsi="Calibri"/>
           <w:sz w:val="20"/>
         </w:rPr>
-        <w:t>Recunoaștere și control. Nu inventăm, urmărim fenomenul.</w:t>
+        <w:t>Testare de inginer. Mecanismul construit nu e dovada că funcționează. Refresh-ul dă verdictul.</w:t>
       </w:r>
     </w:p>
     <w:p>
@@ -1662,7 +1662,7 @@
           <w:i/>
           <w:sz w:val="20"/>
         </w:rPr>
-        <w:t>„Etapa 4: verificare. Nu construim mai mult decât e necesar."</w:t>
+        <w:t>„Close &amp; Load. Tabelul Vanzari_Normalizat se încarcă. AGGREGATE pe coloana valoare_neta confirmă martorul. Dacă suma diferă — Power Query are o eroare în flux."</w:t>
       </w:r>
     </w:p>
     <w:p>
@@ -1686,7 +1686,7 @@
           <w:rFonts w:ascii="Calibri" w:hAnsi="Calibri"/>
           <w:sz w:val="20"/>
         </w:rPr>
-        <w:t>Pe ecran: acțiunile concrete ale etapei 4. Cursorul navighează, AI raportează, datele se schimbă controlat.</w:t>
+        <w:t>Pe ecran: Close &amp; Load to Table. Tabelul Vanzari_Normalizat în Excel: 2.000 rânduri × 14 coloane. =AGGREGATE(9,5,Vanzari_Normalizat[valoare_neta]) → 7.986.019,38 lei. Egal cu martorul C01. Delta 0 — fluxul e fidel.</w:t>
       </w:r>
     </w:p>
     <w:p>
@@ -1710,7 +1710,7 @@
           <w:rFonts w:ascii="Calibri" w:hAnsi="Calibri"/>
           <w:sz w:val="20"/>
         </w:rPr>
-        <w:t>AI propune, noi confirmăm. Niciun pas neexplicit.</w:t>
+        <w:t>AI verifică că fiecare Applied Step a funcționat conform arhitecturii: tipuri corecte, valori sursă conservate semantic, zero pierderi de date.</w:t>
       </w:r>
     </w:p>
     <w:p>
@@ -1734,7 +1734,7 @@
           <w:rFonts w:ascii="Calibri" w:hAnsi="Calibri"/>
           <w:sz w:val="20"/>
         </w:rPr>
-        <w:t>Confirmăm martorul: 'Etapa 4 confirmată. Predăm mai departe.'</w:t>
+        <w:t>„Suma conservată: 7.986.019,38 lei. 10 Applied Steps vizibili în panoul Power Query. Fluxul — funcțional și verificat."</w:t>
       </w:r>
     </w:p>
     <w:p>
@@ -1758,7 +1758,7 @@
           <w:rFonts w:ascii="Calibri" w:hAnsi="Calibri"/>
           <w:sz w:val="20"/>
         </w:rPr>
-        <w:t>Pe ecran: efectul etapei 4 vizibil. Fenomenul recunoscut, transformat sau verificat.</w:t>
+        <w:t>Pe ecran: tabelul Vanzari_Normalizat curat alături de panoul Queries cu cei 10 pași. Mecanismul e viu.</w:t>
       </w:r>
     </w:p>
     <w:p>
@@ -1842,7 +1842,7 @@
           <w:rFonts w:ascii="Calibri" w:hAnsi="Calibri"/>
           <w:sz w:val="20"/>
         </w:rPr>
-        <w:t>Recunoaștere și control. Nu inventăm, urmărim fenomenul.</w:t>
+        <w:t>Satisfacție de automatizare. Nu mai fac niciodată asta manual.</w:t>
       </w:r>
     </w:p>
     <w:p>
@@ -1867,7 +1867,7 @@
           <w:i/>
           <w:sz w:val="20"/>
         </w:rPr>
-        <w:t>„Etapa 5: stabilizare. Nu construim mai mult decât e necesar."</w:t>
+        <w:t>„Simulez luna viitoare: înlocuiesc sursa cu un export nou din ERP, apăs Data → Refresh All. Cei 10 Applied Steps se re-aplică. Zero intervenție manuală. Zero risc de omitere."</w:t>
       </w:r>
     </w:p>
     <w:p>
@@ -1891,7 +1891,7 @@
           <w:rFonts w:ascii="Calibri" w:hAnsi="Calibri"/>
           <w:sz w:val="20"/>
         </w:rPr>
-        <w:t>Pe ecran: acțiunile concrete ale etapei 5. Cursorul navighează, AI raportează, datele se schimbă controlat.</w:t>
+        <w:t>Pe ecran: schimbăm fișierul sursă cu o versiune-test cu 100 rânduri noi adăugate. Data → Refresh All. Power Query rulează cei 10 pași. Tabelul Vanzari_Normalizat: 2.100 rânduri. Suma nouă — actualizată corect. Mecanismul a funcționat fără nicio intervenție manuală.</w:t>
       </w:r>
     </w:p>
     <w:p>
@@ -1915,7 +1915,7 @@
           <w:rFonts w:ascii="Calibri" w:hAnsi="Calibri"/>
           <w:sz w:val="20"/>
         </w:rPr>
-        <w:t>AI propune, noi confirmăm. Niciun pas neexplicit.</w:t>
+        <w:t>AI confirmă că Applied Steps s-au re-aplicat identic pe sursa nouă. Zero pași manuali. Zero risc de omitere. Fluxul e idempotent.</w:t>
       </w:r>
     </w:p>
     <w:p>
@@ -1939,7 +1939,7 @@
           <w:rFonts w:ascii="Calibri" w:hAnsi="Calibri"/>
           <w:sz w:val="20"/>
         </w:rPr>
-        <w:t>Confirmăm martorul: 'Etapa 5 confirmată. Predăm mai departe.'</w:t>
+        <w:t>„Sursa nouă. Refresh All. 2.100 rânduri normalizate automat. Mecanismul muncește singur."</w:t>
       </w:r>
     </w:p>
     <w:p>
@@ -1963,7 +1963,7 @@
           <w:rFonts w:ascii="Calibri" w:hAnsi="Calibri"/>
           <w:sz w:val="20"/>
         </w:rPr>
-        <w:t>Pe ecran: efectul etapei 5 vizibil. Fenomenul recunoscut, transformat sau verificat.</w:t>
+        <w:t>Pe ecran: Refresh All apăsat. Tabelul actualizat. Panoul Applied Steps — același. Mecanismul muncește singur.</w:t>
       </w:r>
     </w:p>
     <w:p>
@@ -2048,7 +2048,7 @@
           <w:rFonts w:ascii="Calibri" w:hAnsi="Calibri"/>
           <w:sz w:val="20"/>
         </w:rPr>
-        <w:t>Recunoaștere și control. Nu inventăm, urmărim fenomenul.</w:t>
+        <w:t>Predare de sistem, nu de fișier. C04 nu predă un tabel curat — predă un mecanism viu.</w:t>
       </w:r>
     </w:p>
     <w:p>
@@ -2073,7 +2073,7 @@
           <w:i/>
           <w:sz w:val="20"/>
         </w:rPr>
-        <w:t>„Etapa 6: confirmare. Nu construim mai mult decât e necesar."</w:t>
+        <w:t>„Predau Treapta 1 completă: structura curată (C01), controlul anomaliilor (C02), dovada forensică (C03), și acum fluxul automat (C04). T2 preia un set care se reface singur."</w:t>
       </w:r>
     </w:p>
     <w:p>
@@ -2097,7 +2097,7 @@
           <w:rFonts w:ascii="Calibri" w:hAnsi="Calibri"/>
           <w:sz w:val="20"/>
         </w:rPr>
-        <w:t>Pe ecran: acțiunile concrete ale etapei 6. Cursorul navighează, AI raportează, datele se schimbă controlat.</w:t>
+        <w:t>Pe ecran: fișierul Date_MASTER-C04.xlsx. Tabelul Vanzari_Normalizat × 14 coloane × 2.000 rânduri. Panoul Queries: fluxul Power Query cu 10 Applied Steps. Suma 7.986.019,38 lei. Refresh All disponibil.</w:t>
       </w:r>
     </w:p>
     <w:p>
@@ -2121,7 +2121,7 @@
           <w:rFonts w:ascii="Calibri" w:hAnsi="Calibri"/>
           <w:sz w:val="20"/>
         </w:rPr>
-        <w:t>AI propune, noi confirmăm. Niciun pas neexplicit.</w:t>
+        <w:t>AI rezumă T1: C01 a construit structura, C02 a confruntat valorile, C03 a documentat contaminările, C04 a automatizat curățarea. Treapta 1 — completă. Treapta 2 CUNOAȘTERE preia un set viu.</w:t>
       </w:r>
     </w:p>
     <w:p>
@@ -2145,7 +2145,7 @@
           <w:rFonts w:ascii="Calibri" w:hAnsi="Calibri"/>
           <w:sz w:val="20"/>
         </w:rPr>
-        <w:t>Confirmăm martorul: 'Etapa 6 confirmată. Predăm mai departe.'</w:t>
+        <w:t>„Suma conservată. Fluxul activ. 10 Applied Steps documentați. T1 STRUCTURA — întemeiată. Predăm T2 CUNOAȘTERE."</w:t>
       </w:r>
     </w:p>
     <w:p>
@@ -2169,7 +2169,7 @@
           <w:rFonts w:ascii="Calibri" w:hAnsi="Calibri"/>
           <w:sz w:val="20"/>
         </w:rPr>
-        <w:t>Pe ecran: efectul etapei 6 vizibil. Fenomenul recunoscut, transformat sau verificat.</w:t>
+        <w:t>Pe ecran: tranziție elegantă. Tabelul Vanzari_Normalizat curat cu Refresh All iluminat. T1 predă un mecanism. Treapta 2 primește un set care se reface singur.</w:t>
       </w:r>
     </w:p>
     <w:p>

</xml_diff>